<commit_message>
Format Methods formulas as editable Word equations
</commit_message>
<xml_diff>
--- a/manuscript/theory_calculation_complete_package/METHODS.docx
+++ b/manuscript/theory_calculation_complete_package/METHODS.docx
@@ -20,12 +20,238 @@
     </w:p>
     <w:p>
       <w:r>
-        <w:t>Spin-polarized density-functional-theory (DFT) calculations were performed with the Quickstep module of CP2K using the Gaussian and plane-wave scheme [1] and the Perdew-Burke-Ernzerhof (PBE) generalized-gradient approximation [2]. Goedecker-Teter-Hutter pseudopotentials [3] and MOLOPT Gaussian basis sets [4] were employed: TZVP-MOLOPT-PBE-GTH-q17 for Co, TZVP-MOLOPT-PBE-GTH-q6 for O, TZVP-MOLOPT-PBE-GTH-q1 for H, and DZVP-MOLOPT-PBE-GTH-q3 for Al. A rotationally invariant DFT+U correction [5] was applied to Co 3d states with an effective interaction U-J = 0.1212728 Hartree (3.30 eV). The auxiliary plane-wave density and relative cutoffs were 400 and 55 Ry, respectively. Electronic self-consistency was achieved by conjugate-gradient minimization of the orbital-transformation functional [6], preconditioned through a Cholesky-based inverse of the shifted Kohn-Sham Hamiltonian-overlap operator. The inner self-consistent-field thresholds were 1 x 10^-7 for pristine and 1 x 10^-6 for Al-substituted structures; the outer threshold was 1 x 10^-6 for both.</w:t>
+        <w:t xml:space="preserve">Spin-polarized density-functional-theory (DFT) calculations were performed with the Quickstep module of CP2K using the Gaussian and plane-wave scheme [1] and the Perdew-Burke-Ernzerhof (PBE) generalized-gradient approximation [2]. Goedecker-Teter-Hutter pseudopotentials [3] and MOLOPT Gaussian basis sets [4] were employed: TZVP-MOLOPT-PBE-GTH-q17 for Co, TZVP-MOLOPT-PBE-GTH-q6 for O, TZVP-MOLOPT-PBE-GTH-q1 for H, and DZVP-MOLOPT-PBE-GTH-q3 for Al. A rotationally invariant DFT+U correction [5] was applied to Co 3d states with an effective interaction </w:t>
+      </w:r>
+      <m:oMath>
+        <m:r>
+          <m:t>U − J = 0.1212728 Hartree (3.30 eV)</m:t>
+        </m:r>
+      </m:oMath>
+      <w:r>
+        <w:t xml:space="preserve">. The auxiliary plane-wave density and relative cutoffs were 400 and 55 Ry, respectively. Electronic self-consistency was achieved by conjugate-gradient minimization of the orbital-transformation functional [6], preconditioned through a Cholesky-based inverse of the shifted Kohn-Sham Hamiltonian-overlap operator. The inner self-consistent-field thresholds were </w:t>
+      </w:r>
+      <m:oMath>
+        <m:r>
+          <m:t>1 × </m:t>
+        </m:r>
+        <m:sSup>
+          <m:e>
+            <m:r>
+              <m:t>10</m:t>
+            </m:r>
+          </m:e>
+          <m:sup>
+            <m:r>
+              <m:t>-7</m:t>
+            </m:r>
+          </m:sup>
+        </m:sSup>
+      </m:oMath>
+      <w:r>
+        <w:t xml:space="preserve"> for pristine and </w:t>
+      </w:r>
+      <m:oMath>
+        <m:r>
+          <m:t>1 × </m:t>
+        </m:r>
+        <m:sSup>
+          <m:e>
+            <m:r>
+              <m:t>10</m:t>
+            </m:r>
+          </m:e>
+          <m:sup>
+            <m:r>
+              <m:t>-6</m:t>
+            </m:r>
+          </m:sup>
+        </m:sSup>
+      </m:oMath>
+      <w:r>
+        <w:t xml:space="preserve"> for Al-substituted structures; the outer threshold was </w:t>
+      </w:r>
+      <m:oMath>
+        <m:r>
+          <m:t>1 × </m:t>
+        </m:r>
+        <m:sSup>
+          <m:e>
+            <m:r>
+              <m:t>10</m:t>
+            </m:r>
+          </m:e>
+          <m:sup>
+            <m:r>
+              <m:t>-6</m:t>
+            </m:r>
+          </m:sup>
+        </m:sSup>
+      </m:oMath>
+      <w:r>
+        <w:t xml:space="preserve"> for both.</w:t>
       </w:r>
     </w:p>
     <w:p>
       <w:r>
-        <w:t>Pristine and Al-substituted CoOOH were described with the same periodic orthorhombic CP2K supercell (a = 8.6482 Angstrom, b = 26.0793 Angstrom, c = 21.6574 Angstrom). The pristine *OH model had composition Co48H60O114; the Al-substituted model had composition Co40Al8H60O114. The corresponding *O structures were generated by removal of the adsorbate proton. After wrapping the archived coordinates into this cell, the atom-free interval between periodic slab images along z was 12.10-12.51 Angstrom across the four *OH/*O structures. No additional crystallographic symmetry was imposed.</w:t>
+        <w:t>Pristine and Al-substituted CoOOH were described with the same periodic orthorhombic CP2K supercell (</w:t>
+      </w:r>
+      <m:oMath>
+        <m:r>
+          <m:t>a = 8.6482 Å</m:t>
+        </m:r>
+      </m:oMath>
+      <w:r>
+        <w:t xml:space="preserve">, </w:t>
+      </w:r>
+      <m:oMath>
+        <m:r>
+          <m:t>b = 26.0793 Å</m:t>
+        </m:r>
+      </m:oMath>
+      <w:r>
+        <w:t xml:space="preserve">, </w:t>
+      </w:r>
+      <m:oMath>
+        <m:r>
+          <m:t>c = 21.6574 Å</m:t>
+        </m:r>
+      </m:oMath>
+      <w:r>
+        <w:t xml:space="preserve">). The pristine </w:t>
+      </w:r>
+      <m:oMath>
+        <m:r>
+          <m:t>*OH</m:t>
+        </m:r>
+      </m:oMath>
+      <w:r>
+        <w:t xml:space="preserve"> model had composition </w:t>
+      </w:r>
+      <m:oMath>
+        <m:sSub>
+          <m:e>
+            <m:r>
+              <m:t>Co</m:t>
+            </m:r>
+          </m:e>
+          <m:sub>
+            <m:r>
+              <m:t>48</m:t>
+            </m:r>
+          </m:sub>
+        </m:sSub>
+        <m:sSub>
+          <m:e>
+            <m:r>
+              <m:t>H</m:t>
+            </m:r>
+          </m:e>
+          <m:sub>
+            <m:r>
+              <m:t>60</m:t>
+            </m:r>
+          </m:sub>
+        </m:sSub>
+        <m:sSub>
+          <m:e>
+            <m:r>
+              <m:t>O</m:t>
+            </m:r>
+          </m:e>
+          <m:sub>
+            <m:r>
+              <m:t>114</m:t>
+            </m:r>
+          </m:sub>
+        </m:sSub>
+      </m:oMath>
+      <w:r>
+        <w:t xml:space="preserve">; the Al-substituted model had composition </w:t>
+      </w:r>
+      <m:oMath>
+        <m:sSub>
+          <m:e>
+            <m:r>
+              <m:t>Co</m:t>
+            </m:r>
+          </m:e>
+          <m:sub>
+            <m:r>
+              <m:t>40</m:t>
+            </m:r>
+          </m:sub>
+        </m:sSub>
+        <m:sSub>
+          <m:e>
+            <m:r>
+              <m:t>Al</m:t>
+            </m:r>
+          </m:e>
+          <m:sub>
+            <m:r>
+              <m:t>8</m:t>
+            </m:r>
+          </m:sub>
+        </m:sSub>
+        <m:sSub>
+          <m:e>
+            <m:r>
+              <m:t>H</m:t>
+            </m:r>
+          </m:e>
+          <m:sub>
+            <m:r>
+              <m:t>60</m:t>
+            </m:r>
+          </m:sub>
+        </m:sSub>
+        <m:sSub>
+          <m:e>
+            <m:r>
+              <m:t>O</m:t>
+            </m:r>
+          </m:e>
+          <m:sub>
+            <m:r>
+              <m:t>114</m:t>
+            </m:r>
+          </m:sub>
+        </m:sSub>
+      </m:oMath>
+      <w:r>
+        <w:t xml:space="preserve">. The corresponding </w:t>
+      </w:r>
+      <m:oMath>
+        <m:r>
+          <m:t>*O</m:t>
+        </m:r>
+      </m:oMath>
+      <w:r>
+        <w:t xml:space="preserve"> structures were generated by removal of the adsorbate proton. After wrapping the archived coordinates into this cell, the atom-free interval between periodic slab images along z was </w:t>
+      </w:r>
+      <m:oMath>
+        <m:r>
+          <m:t>12.10–12.51 Å</m:t>
+        </m:r>
+      </m:oMath>
+      <w:r>
+        <w:t xml:space="preserve"> across the four </w:t>
+      </w:r>
+      <m:oMath>
+        <m:r>
+          <m:t>*OH</m:t>
+        </m:r>
+      </m:oMath>
+      <w:r>
+        <w:t>/</w:t>
+      </w:r>
+      <m:oMath>
+        <m:r>
+          <m:t>*O</m:t>
+        </m:r>
+      </m:oMath>
+      <w:r>
+        <w:t xml:space="preserve"> structures. No additional crystallographic symmetry was imposed.</w:t>
       </w:r>
     </w:p>
     <w:p>
@@ -38,17 +264,114 @@
     </w:p>
     <w:p>
       <w:r>
-        <w:t>The oxygen-evolution pathway was represented by the conventional sequence * -&gt; *OH -&gt; *O -&gt; *OOH -&gt; O2. Relative electronic energies of the intermediates were obtained from spin-polarized CP2K calculations to compare pristine Co sites, Co sites adjacent to Al substitution, and Al-site controls. These historical cross-system step energies are electronic-energy comparisons; they are not presented as a matched 298.15 K Gibbs free-energy series.</w:t>
+        <w:t xml:space="preserve">The oxygen-evolution pathway was represented by the conventional sequence * -&gt; </w:t>
+      </w:r>
+      <m:oMath>
+        <m:r>
+          <m:t>*OH</m:t>
+        </m:r>
+      </m:oMath>
+      <w:r>
+        <w:t xml:space="preserve"> -&gt; </w:t>
+      </w:r>
+      <m:oMath>
+        <m:r>
+          <m:t>*O</m:t>
+        </m:r>
+      </m:oMath>
+      <w:r>
+        <w:t xml:space="preserve"> -&gt; </w:t>
+      </w:r>
+      <m:oMath>
+        <m:r>
+          <m:t>*OOH</m:t>
+        </m:r>
+      </m:oMath>
+      <w:r>
+        <w:t xml:space="preserve"> -&gt; </w:t>
+      </w:r>
+      <m:oMath>
+        <m:sSub>
+          <m:e>
+            <m:r>
+              <m:t>O</m:t>
+            </m:r>
+          </m:e>
+          <m:sub>
+            <m:r>
+              <m:t>2</m:t>
+            </m:r>
+          </m:sub>
+        </m:sSub>
+      </m:oMath>
+      <w:r>
+        <w:t>. Relative electronic energies of the intermediates were obtained from spin-polarized CP2K calculations to compare pristine Co sites, Co sites adjacent to Al substitution, and Al-site controls. These historical cross-system step energies are electronic-energy comparisons; they are not presented as a matched 298.15 K Gibbs free-energy series.</w:t>
       </w:r>
     </w:p>
     <w:p>
       <w:r>
-        <w:t>Constrained DFT (cDFT) calculations were performed within CP2K [7] to probe localization and redistribution of charge and spin. Charge constraints were applied either to the active Co center or to a combined active-Co/adsorbate fragment, using N-1 and N+1 perturbations. Selected local-spin constraints were also applied to the *O state. The energy difference between a constrained solution and its corresponding unconstrained solution was used as the cDFT constraint penalty, not as a reaction activation barrier.</w:t>
+        <w:t xml:space="preserve">Constrained DFT (cDFT) calculations were performed within CP2K [7] to probe localization and redistribution of charge and spin. Charge constraints were applied either to the active Co center or to a combined active-Co/adsorbate fragment, using </w:t>
+      </w:r>
+      <m:oMath>
+        <m:r>
+          <m:t>N − 1</m:t>
+        </m:r>
+      </m:oMath>
+      <w:r>
+        <w:t xml:space="preserve"> and </w:t>
+      </w:r>
+      <m:oMath>
+        <m:r>
+          <m:t>N + 1</m:t>
+        </m:r>
+      </m:oMath>
+      <w:r>
+        <w:t xml:space="preserve"> perturbations. Selected local-spin constraints were also applied to the </w:t>
+      </w:r>
+      <m:oMath>
+        <m:r>
+          <m:t>*O</m:t>
+        </m:r>
+      </m:oMath>
+      <w:r>
+        <w:t xml:space="preserve"> state. The energy difference between a constrained solution and its corresponding unconstrained solution was used as the cDFT constraint penalty, not as a reaction activation barrier.</w:t>
       </w:r>
     </w:p>
     <w:p>
       <w:r>
-        <w:t>Local electron populations and spin moments were evaluated using both Hirshfeld and Mulliken partitioning. Reaction-induced changes were defined as the value for *O minus that for *OH. Spin-resolved population changes were further decomposed into alpha- and beta-electron contributions.</w:t>
+        <w:t xml:space="preserve">Local electron populations and spin moments were evaluated using both Hirshfeld and Mulliken partitioning. Reaction-induced changes were defined as the value for </w:t>
+      </w:r>
+      <m:oMath>
+        <m:r>
+          <m:t>*O</m:t>
+        </m:r>
+      </m:oMath>
+      <w:r>
+        <w:t xml:space="preserve"> minus that for </w:t>
+      </w:r>
+      <m:oMath>
+        <m:r>
+          <m:t>*OH</m:t>
+        </m:r>
+      </m:oMath>
+      <w:r>
+        <w:t xml:space="preserve">. Spin-resolved population changes were further decomposed into </w:t>
+      </w:r>
+      <m:oMath>
+        <m:r>
+          <m:t>α-</m:t>
+        </m:r>
+      </m:oMath>
+      <w:r>
+        <w:t xml:space="preserve"> and </w:t>
+      </w:r>
+      <m:oMath>
+        <m:r>
+          <m:t>β-</m:t>
+        </m:r>
+      </m:oMath>
+      <w:r>
+        <w:t>electron contributions.</w:t>
       </w:r>
     </w:p>
     <w:p>
@@ -61,33 +384,299 @@
     </w:p>
     <w:p>
       <w:r>
-        <w:t>Complementary spin-polarized, fixed-geometry electronic-structure calculations were performed with VASP [8] using projector-augmented-wave potentials [9], PBE [2], and a Co 3d DFT+U correction [5] with U-J = 4.50 eV. The VASP calculations used a 520 eV plane-wave cutoff and the zero-damped D3 dispersion correction [10]. The Co U value was fixed across the matched pristine and Al-substituted VASP states; the CP2K and VASP U values belong to separate projector/basis implementations and were not used to compare absolute total energies between codes. The VASP cell had a 27.5481 Angstrom z lattice vector and an atom-free periodic-image interval of 19.07 Angstrom in the four matched *OH/*O structures.</w:t>
+        <w:t xml:space="preserve">Complementary spin-polarized, fixed-geometry electronic-structure calculations were performed with VASP [8] using projector-augmented-wave potentials [9], PBE [2], and a Co 3d DFT+U correction [5] with </w:t>
+      </w:r>
+      <m:oMath>
+        <m:r>
+          <m:t>U − J = 4.50 eV</m:t>
+        </m:r>
+      </m:oMath>
+      <w:r>
+        <w:t xml:space="preserve">. The VASP calculations used a 520 eV plane-wave cutoff and the zero-damped D3 dispersion correction [10]. The Co U value was fixed across the matched pristine and Al-substituted VASP states; the CP2K and VASP U values belong to separate projector/basis implementations and were not used to compare absolute total energies between codes. The VASP cell had a </w:t>
+      </w:r>
+      <m:oMath>
+        <m:r>
+          <m:t>27.5481 Å</m:t>
+        </m:r>
+      </m:oMath>
+      <w:r>
+        <w:t xml:space="preserve"> z lattice vector and an atom-free periodic-image interval of </w:t>
+      </w:r>
+      <m:oMath>
+        <m:r>
+          <m:t>19.07 Å</m:t>
+        </m:r>
+      </m:oMath>
+      <w:r>
+        <w:t xml:space="preserve"> in the four matched </w:t>
+      </w:r>
+      <m:oMath>
+        <m:r>
+          <m:t>*OH</m:t>
+        </m:r>
+      </m:oMath>
+      <w:r>
+        <w:t>/</w:t>
+      </w:r>
+      <m:oMath>
+        <m:r>
+          <m:t>*O</m:t>
+        </m:r>
+      </m:oMath>
+      <w:r>
+        <w:t xml:space="preserve"> structures.</w:t>
       </w:r>
     </w:p>
     <w:p>
       <w:r>
-        <w:t>To isolate electronic redistribution in the *OH -&gt; *O step from structural relaxation, the *O electron density was evaluated at the corresponding *OH geometry. The reaction-induced charge-density difference was defined as</w:t>
+        <w:t xml:space="preserve">To isolate electronic redistribution in the </w:t>
+      </w:r>
+      <m:oMath>
+        <m:r>
+          <m:t>*OH</m:t>
+        </m:r>
+      </m:oMath>
+      <w:r>
+        <w:t xml:space="preserve"> -&gt; </w:t>
+      </w:r>
+      <m:oMath>
+        <m:r>
+          <m:t>*O</m:t>
+        </m:r>
+      </m:oMath>
+      <w:r>
+        <w:t xml:space="preserve"> step from structural relaxation, the </w:t>
+      </w:r>
+      <m:oMath>
+        <m:r>
+          <m:t>*O</m:t>
+        </m:r>
+      </m:oMath>
+      <w:r>
+        <w:t xml:space="preserve"> electron density was evaluated at the corresponding </w:t>
+      </w:r>
+      <m:oMath>
+        <m:r>
+          <m:t>*OH</m:t>
+        </m:r>
+      </m:oMath>
+      <w:r>
+        <w:t xml:space="preserve"> geometry. The reaction-induced charge-density difference was defined as</w:t>
       </w:r>
     </w:p>
     <w:p>
+      <w:pPr>
+        <w:jc w:val="center"/>
+      </w:pPr>
+      <m:oMathPara>
+        <m:oMath>
+          <m:r>
+            <m:t>Δ</m:t>
+          </m:r>
+          <m:r>
+            <m:t>ρ</m:t>
+          </m:r>
+          <m:r>
+            <m:t> = </m:t>
+          </m:r>
+          <m:r>
+            <m:t>ρ</m:t>
+          </m:r>
+          <m:r>
+            <m:t>(*O; </m:t>
+          </m:r>
+          <m:sSub>
+            <m:e>
+              <m:r>
+                <m:t>R</m:t>
+              </m:r>
+            </m:e>
+            <m:sub>
+              <m:r>
+                <m:t>*OH</m:t>
+              </m:r>
+            </m:sub>
+          </m:sSub>
+          <m:r>
+            <m:t>) − </m:t>
+          </m:r>
+          <m:r>
+            <m:t>ρ</m:t>
+          </m:r>
+          <m:r>
+            <m:t>(*OH; </m:t>
+          </m:r>
+          <m:sSub>
+            <m:e>
+              <m:r>
+                <m:t>R</m:t>
+              </m:r>
+            </m:e>
+            <m:sub>
+              <m:r>
+                <m:t>*OH</m:t>
+              </m:r>
+            </m:sub>
+          </m:sSub>
+          <m:r>
+            <m:t>)</m:t>
+          </m:r>
+        </m:oMath>
+      </m:oMathPara>
+    </w:p>
+    <w:p>
       <w:r>
-        <w:t>Delta rho = rho(*O; R_*OH) - rho(*OH; R_*OH),</w:t>
+        <w:t>where R_</w:t>
+      </w:r>
+      <m:oMath>
+        <m:r>
+          <m:t>*OH</m:t>
+        </m:r>
+      </m:oMath>
+      <w:r>
+        <w:t xml:space="preserve"> is the </w:t>
+      </w:r>
+      <m:oMath>
+        <m:r>
+          <m:t>*OH</m:t>
+        </m:r>
+      </m:oMath>
+      <w:r>
+        <w:t xml:space="preserve"> geometry. The magnetization-density difference, </w:t>
+      </w:r>
+      <m:oMath>
+        <m:r>
+          <m:t>Δm</m:t>
+        </m:r>
+      </m:oMath>
+      <w:r>
+        <w:t xml:space="preserve">, was evaluated analogously. With </w:t>
+      </w:r>
+      <m:oMath>
+        <m:r>
+          <m:t>m = </m:t>
+        </m:r>
+        <m:sSub>
+          <m:e>
+            <m:r>
+              <m:t>ρ</m:t>
+            </m:r>
+          </m:e>
+          <m:sub>
+            <m:r>
+              <m:t>↑</m:t>
+            </m:r>
+          </m:sub>
+        </m:sSub>
+        <m:r>
+          <m:t> − </m:t>
+        </m:r>
+        <m:sSub>
+          <m:e>
+            <m:r>
+              <m:t>ρ</m:t>
+            </m:r>
+          </m:e>
+          <m:sub>
+            <m:r>
+              <m:t>↓</m:t>
+            </m:r>
+          </m:sub>
+        </m:sSub>
+      </m:oMath>
+      <w:r>
+        <w:t>, the spin-resolved density differences were obtained from</w:t>
       </w:r>
     </w:p>
     <w:p>
-      <w:r>
-        <w:t>where R_*OH is the *OH geometry. The magnetization-density difference, Delta m, was evaluated analogously. With m = rho_up - rho_down, the spin-resolved density differences were obtained from</w:t>
-      </w:r>
+      <w:pPr>
+        <w:jc w:val="center"/>
+      </w:pPr>
+      <m:oMathPara>
+        <m:oMath>
+          <m:r>
+            <m:t>Δ</m:t>
+          </m:r>
+          <m:sSub>
+            <m:e>
+              <m:r>
+                <m:t>ρ</m:t>
+              </m:r>
+            </m:e>
+            <m:sub>
+              <m:r>
+                <m:t>↑</m:t>
+              </m:r>
+            </m:sub>
+          </m:sSub>
+          <m:r>
+            <m:t> = </m:t>
+          </m:r>
+          <m:f>
+            <m:num>
+              <m:r>
+                <m:t>Δ</m:t>
+              </m:r>
+              <m:r>
+                <m:t>ρ</m:t>
+              </m:r>
+              <m:r>
+                <m:t> + Δm</m:t>
+              </m:r>
+            </m:num>
+            <m:den>
+              <m:r>
+                <m:t>2</m:t>
+              </m:r>
+            </m:den>
+          </m:f>
+        </m:oMath>
+      </m:oMathPara>
     </w:p>
     <w:p>
-      <w:r>
-        <w:t>Delta rho_up = (Delta rho + Delta m)/2,</w:t>
-      </w:r>
-    </w:p>
-    <w:p>
-      <w:r>
-        <w:t>Delta rho_down = (Delta rho - Delta m)/2.</w:t>
-      </w:r>
+      <w:pPr>
+        <w:jc w:val="center"/>
+      </w:pPr>
+      <m:oMathPara>
+        <m:oMath>
+          <m:r>
+            <m:t>Δ</m:t>
+          </m:r>
+          <m:sSub>
+            <m:e>
+              <m:r>
+                <m:t>ρ</m:t>
+              </m:r>
+            </m:e>
+            <m:sub>
+              <m:r>
+                <m:t>↓</m:t>
+              </m:r>
+            </m:sub>
+          </m:sSub>
+          <m:r>
+            <m:t> = </m:t>
+          </m:r>
+          <m:f>
+            <m:num>
+              <m:r>
+                <m:t>Δ</m:t>
+              </m:r>
+              <m:r>
+                <m:t>ρ</m:t>
+              </m:r>
+              <m:r>
+                <m:t> − Δm</m:t>
+              </m:r>
+            </m:num>
+            <m:den>
+              <m:r>
+                <m:t>2</m:t>
+              </m:r>
+            </m:den>
+          </m:f>
+        </m:oMath>
+      </m:oMathPara>
     </w:p>
     <w:p>
       <w:r>
@@ -108,9 +697,70 @@
       </w:r>
     </w:p>
     <w:p>
-      <w:r>
-        <w:t>epsilon_d = integral[E rho_d(E) dE] / integral[rho_d(E) dE],</w:t>
-      </w:r>
+      <w:pPr>
+        <w:jc w:val="center"/>
+      </w:pPr>
+      <m:oMathPara>
+        <m:oMath>
+          <m:sSub>
+            <m:e>
+              <m:r>
+                <m:t>ε</m:t>
+              </m:r>
+            </m:e>
+            <m:sub>
+              <m:r>
+                <m:t>d</m:t>
+              </m:r>
+            </m:sub>
+          </m:sSub>
+          <m:r>
+            <m:t> = </m:t>
+          </m:r>
+          <m:f>
+            <m:num>
+              <m:r>
+                <m:t>∫ E</m:t>
+              </m:r>
+              <m:sSub>
+                <m:e>
+                  <m:r>
+                    <m:t>ρ</m:t>
+                  </m:r>
+                </m:e>
+                <m:sub>
+                  <m:r>
+                    <m:t>d</m:t>
+                  </m:r>
+                </m:sub>
+              </m:sSub>
+              <m:r>
+                <m:t>(E) dE</m:t>
+              </m:r>
+            </m:num>
+            <m:den>
+              <m:r>
+                <m:t>∫ </m:t>
+              </m:r>
+              <m:sSub>
+                <m:e>
+                  <m:r>
+                    <m:t>ρ</m:t>
+                  </m:r>
+                </m:e>
+                <m:sub>
+                  <m:r>
+                    <m:t>d</m:t>
+                  </m:r>
+                </m:sub>
+              </m:sSub>
+              <m:r>
+                <m:t>(E) dE</m:t>
+              </m:r>
+            </m:den>
+          </m:f>
+        </m:oMath>
+      </m:oMathPara>
     </w:p>
     <w:p>
       <w:r>
@@ -119,7 +769,23 @@
     </w:p>
     <w:p>
       <w:r>
-        <w:t>Bader charge analysis [11] was performed for the matched fixed-geometry VASP calculations. Changes in Bader electron population for the *OH -&gt; *O step were evaluated for the active Co, adsorbate O, bridge O, and neighboring Co/Al site using consistent atom mapping between the two states.</w:t>
+        <w:t xml:space="preserve">Bader charge analysis [11] was performed for the matched fixed-geometry VASP calculations. Changes in Bader electron population for the </w:t>
+      </w:r>
+      <m:oMath>
+        <m:r>
+          <m:t>*OH</m:t>
+        </m:r>
+      </m:oMath>
+      <w:r>
+        <w:t xml:space="preserve"> -&gt; </w:t>
+      </w:r>
+      <m:oMath>
+        <m:r>
+          <m:t>*O</m:t>
+        </m:r>
+      </m:oMath>
+      <w:r>
+        <w:t xml:space="preserve"> step were evaluated for the active Co, adsorbate O, bridge O, and neighboring Co/Al site using consistent atom mapping between the two states.</w:t>
       </w:r>
     </w:p>
     <w:p>
@@ -132,7 +798,39 @@
     </w:p>
     <w:p>
       <w:r>
-        <w:t>Chemical-bonding analysis was carried out with LOBSTER 5.1.1 [12] using the pbeVaspFit2015 basis set. Projected crystal orbital Hamilton population (pCOHP) and integrated COHP (ICOHP) analyses were performed for relevant Co-O interactions. A Gaussian smearing width of 0.05 eV and an energy range from -15 to +5 eV were used. Bond pairs were assigned from the corresponding structures and checked against interatomic distances. Native pCOHP signs were retained during data extraction; figures plotted as -pCOHP or -ICOHP state the transformed sign convention explicitly. LOBSTER Mulliken and Lowdin orbital populations were additionally used to examine spin-selective redistribution during the *OH -&gt; *O step.</w:t>
+        <w:t xml:space="preserve">Chemical-bonding analysis was carried out with LOBSTER 5.1.1 [12] using the pbeVaspFit2015 basis set. Projected crystal orbital Hamilton population (pCOHP) and integrated COHP (ICOHP) analyses were performed for relevant Co-O interactions. A Gaussian smearing width of 0.05 eV and an energy range from -15 to +5 eV were used. Bond pairs were assigned from the corresponding structures and checked against interatomic distances. Native pCOHP signs were retained during data extraction; figures plotted as </w:t>
+      </w:r>
+      <m:oMath>
+        <m:r>
+          <m:t>−pCOHP</m:t>
+        </m:r>
+      </m:oMath>
+      <w:r>
+        <w:t xml:space="preserve"> or </w:t>
+      </w:r>
+      <m:oMath>
+        <m:r>
+          <m:t>−ICOHP</m:t>
+        </m:r>
+      </m:oMath>
+      <w:r>
+        <w:t xml:space="preserve"> state the transformed sign convention explicitly. LOBSTER Mulliken and Lowdin orbital populations were additionally used to examine spin-selective redistribution during the </w:t>
+      </w:r>
+      <m:oMath>
+        <m:r>
+          <m:t>*OH</m:t>
+        </m:r>
+      </m:oMath>
+      <w:r>
+        <w:t xml:space="preserve"> -&gt; </w:t>
+      </w:r>
+      <m:oMath>
+        <m:r>
+          <m:t>*O</m:t>
+        </m:r>
+      </m:oMath>
+      <w:r>
+        <w:t xml:space="preserve"> step.</w:t>
       </w:r>
     </w:p>
     <w:p>

</xml_diff>

<commit_message>
Preserve spacing in native Word Methods equations
</commit_message>
<xml_diff>
--- a/manuscript/theory_calculation_complete_package/METHODS.docx
+++ b/manuscript/theory_calculation_complete_package/METHODS.docx
@@ -32,7 +32,7 @@
       </w:r>
       <m:oMath>
         <m:r>
-          <m:t>1 × </m:t>
+          <m:t xml:space="preserve">1 × </m:t>
         </m:r>
         <m:sSup>
           <m:e>
@@ -52,7 +52,7 @@
       </w:r>
       <m:oMath>
         <m:r>
-          <m:t>1 × </m:t>
+          <m:t xml:space="preserve">1 × </m:t>
         </m:r>
         <m:sSup>
           <m:e>
@@ -72,7 +72,7 @@
       </w:r>
       <m:oMath>
         <m:r>
-          <m:t>1 × </m:t>
+          <m:t xml:space="preserve">1 × </m:t>
         </m:r>
         <m:sSup>
           <m:e>
@@ -477,13 +477,13 @@
             <m:t>ρ</m:t>
           </m:r>
           <m:r>
-            <m:t> = </m:t>
+            <m:t xml:space="preserve"> = </m:t>
           </m:r>
           <m:r>
             <m:t>ρ</m:t>
           </m:r>
           <m:r>
-            <m:t>(*O; </m:t>
+            <m:t xml:space="preserve">(*O; </m:t>
           </m:r>
           <m:sSub>
             <m:e>
@@ -498,13 +498,13 @@
             </m:sub>
           </m:sSub>
           <m:r>
-            <m:t>) − </m:t>
+            <m:t xml:space="preserve">) − </m:t>
           </m:r>
           <m:r>
             <m:t>ρ</m:t>
           </m:r>
           <m:r>
-            <m:t>(*OH; </m:t>
+            <m:t xml:space="preserve">(*OH; </m:t>
           </m:r>
           <m:sSub>
             <m:e>
@@ -554,7 +554,7 @@
       </w:r>
       <m:oMath>
         <m:r>
-          <m:t>m = </m:t>
+          <m:t xml:space="preserve">m = </m:t>
         </m:r>
         <m:sSub>
           <m:e>
@@ -569,7 +569,7 @@
           </m:sub>
         </m:sSub>
         <m:r>
-          <m:t> − </m:t>
+          <m:t xml:space="preserve"> − </m:t>
         </m:r>
         <m:sSub>
           <m:e>
@@ -610,7 +610,7 @@
             </m:sub>
           </m:sSub>
           <m:r>
-            <m:t> = </m:t>
+            <m:t xml:space="preserve"> = </m:t>
           </m:r>
           <m:f>
             <m:num>
@@ -621,7 +621,7 @@
                 <m:t>ρ</m:t>
               </m:r>
               <m:r>
-                <m:t> + Δm</m:t>
+                <m:t xml:space="preserve"> + Δm</m:t>
               </m:r>
             </m:num>
             <m:den>
@@ -655,7 +655,7 @@
             </m:sub>
           </m:sSub>
           <m:r>
-            <m:t> = </m:t>
+            <m:t xml:space="preserve"> = </m:t>
           </m:r>
           <m:f>
             <m:num>
@@ -666,7 +666,7 @@
                 <m:t>ρ</m:t>
               </m:r>
               <m:r>
-                <m:t> − Δm</m:t>
+                <m:t xml:space="preserve"> − Δm</m:t>
               </m:r>
             </m:num>
             <m:den>
@@ -715,7 +715,7 @@
             </m:sub>
           </m:sSub>
           <m:r>
-            <m:t> = </m:t>
+            <m:t xml:space="preserve"> = </m:t>
           </m:r>
           <m:f>
             <m:num>
@@ -740,7 +740,7 @@
             </m:num>
             <m:den>
               <m:r>
-                <m:t>∫ </m:t>
+                <m:t xml:space="preserve">∫ </m:t>
               </m:r>
               <m:sSub>
                 <m:e>

</xml_diff>